<commit_message>
chore: audit and streamline project files
</commit_message>
<xml_diff>
--- a/reports/final/NIDS_Project_Report.docx
+++ b/reports/final/NIDS_Project_Report.docx
@@ -1606,7 +1606,7 @@
           <w:spacing w:val="0"/>
           <w:color w:val="12181F"/>
         </w:rPr>
-        <w:t xml:space="preserve">This is the default model artifact directory used by PCAP inference.</w:t>
+        <w:t xml:space="preserve">This is the default model artifact directory used by PCAP inference. It is generated locally after training and is intentionally not committed to Git because model artifacts can be large and environment-specific.</w:t>
       </w:r>
     </w:p>
     <w:p>
@@ -1953,7 +1953,7 @@
           <w:spacing w:val="0"/>
           <w:color w:val="12181F"/>
         </w:rPr>
-        <w:t xml:space="preserve"> to keep the main model directory clean.</w:t>
+        <w:t xml:space="preserve"> to keep the main model directory clean. These experiment artifacts are also local runtime outputs and are not required in the GitHub repository.</w:t>
       </w:r>
     </w:p>
     <w:p>

</xml_diff>